<commit_message>
publish student projects (Fall 2026) 2026-09-22 21:08
</commit_message>
<xml_diff>
--- a/Games/motorbiking-boaters.docx
+++ b/Games/motorbiking-boaters.docx
@@ -1003,10 +1003,22 @@
         <w:t xml:space="preserve">cosmetic-only, no pay-to-win, transparent odds, no manipulative loops</w:t>
       </w:r>
       <w:r>
-        <w:t xml:space="preserve"> </w:t>
-      </w:r>
-      <w:r>
-        <w:t xml:space="preserve">(addressed in the M2 Design goal D8 below). A gacha that gated gameplay power or hid odds would fail that rule; keep it purely cosmetic.</w:t>
+        <w:t xml:space="preserve">. With a solo designer who also carries the D11 art conditional, this rework is</w:t>
+      </w:r>
+      <w:r>
+        <w:t xml:space="preserve"> </w:t>
+      </w:r>
+      <w:r>
+        <w:rPr>
+          <w:b/>
+        </w:rPr>
+        <w:t xml:space="preserve">folded into M2D1</w:t>
+      </w:r>
+      <w:r>
+        <w:t xml:space="preserve"> </w:t>
+      </w:r>
+      <w:r>
+        <w:t xml:space="preserve">(rather than a separate D8) — see the M2 Design goal below. A gacha that gated gameplay power or hid odds would fail that rule; keep it purely cosmetic.</w:t>
       </w:r>
     </w:p>
     <w:p>
@@ -2381,7 +2393,34 @@
         <w:t xml:space="preserve"> </w:t>
       </w:r>
       <w:r>
-        <w:t xml:space="preserve">6 CS + 1 Design + 2 Art (9) — the game reads by its</w:t>
+        <w:t xml:space="preserve">6 CS + 1 Design + 0 Art (7) — a single designer owns the gesture-trick vocabulary, the combo/scoring/risk-reward economy, the procedural-difficulty curve and the (clean) gacha economy (rules: min 1 Design mandated, max 9 total, D+A ≤ 3; see</w:t>
+      </w:r>
+      <w:r>
+        <w:t xml:space="preserve"> </w:t>
+      </w:r>
+      <w:r>
+        <w:rPr>
+          <w:rStyle w:val="VerbatimChar"/>
+        </w:rPr>
+        <w:t xml:space="preserve">team-formation.pdf</w:t>
+      </w:r>
+      <w:r>
+        <w:t xml:space="preserve">).</w:t>
+      </w:r>
+      <w:r>
+        <w:t xml:space="preserve"> </w:t>
+      </w:r>
+      <w:r>
+        <w:rPr>
+          <w:b/>
+        </w:rPr>
+        <w:t xml:space="preserve">Art-risk flag:</w:t>
+      </w:r>
+      <w:r>
+        <w:t xml:space="preserve"> </w:t>
+      </w:r>
+      <w:r>
+        <w:t xml:space="preserve">this game reads by its</w:t>
       </w:r>
       <w:r>
         <w:t xml:space="preserve"> </w:t>
@@ -2393,34 +2432,37 @@
         <w:t xml:space="preserve">trick animation and water/particle VFX</w:t>
       </w:r>
       <w:r>
-        <w:t xml:space="preserve">, so two artists carry the rider + jet-ski, the many trick animations, the water/spray effects, the escalating environments and the gacha cosmetics; a single designer owns the gesture-trick vocabulary, the combo/scoring/risk-reward economy, the procedural-difficulty curve and the (clean) gacha economy (rules: min 1 Design mandated, max 9 total, D+A ≤ 3; see</w:t>
-      </w:r>
-      <w:r>
-        <w:t xml:space="preserve"> </w:t>
-      </w:r>
-      <w:r>
-        <w:rPr>
-          <w:rStyle w:val="VerbatimChar"/>
-        </w:rPr>
-        <w:t xml:space="preserve">team-formation.pdf</w:t>
-      </w:r>
-      <w:r>
-        <w:t xml:space="preserve">). If the trick/economy/gacha</w:t>
-      </w:r>
-      <w:r>
-        <w:t xml:space="preserve"> </w:t>
-      </w:r>
-      <w:r>
-        <w:rPr>
-          <w:b/>
-        </w:rPr>
-        <w:t xml:space="preserve">systems</w:t>
-      </w:r>
-      <w:r>
-        <w:t xml:space="preserve"> </w:t>
-      </w:r>
-      <w:r>
-        <w:t xml:space="preserve">outgrow one designer, trade the 2nd artist for a 2nd designer.</w:t>
+        <w:t xml:space="preserve"> </w:t>
+      </w:r>
+      <w:r>
+        <w:t xml:space="preserve">— the rider + jet-ski, the many trick animations, the water/spray/splash/spark effects, the escalating environments, the HUD and the gacha cosmetics — so</w:t>
+      </w:r>
+      <w:r>
+        <w:t xml:space="preserve"> </w:t>
+      </w:r>
+      <w:r>
+        <w:rPr>
+          <w:b/>
+        </w:rPr>
+        <w:t xml:space="preserve">0 artists is a serious risk</w:t>
+      </w:r>
+      <w:r>
+        <w:t xml:space="preserve">; the designer absorbs all art via the</w:t>
+      </w:r>
+      <w:r>
+        <w:t xml:space="preserve"> </w:t>
+      </w:r>
+      <w:r>
+        <w:rPr>
+          <w:b/>
+        </w:rPr>
+        <w:t xml:space="preserve">D11 conditional</w:t>
+      </w:r>
+      <w:r>
+        <w:t xml:space="preserve"> </w:t>
+      </w:r>
+      <w:r>
+        <w:t xml:space="preserve">(Art Proof of Concept M1 / Art Implementation Quality M2, the last Design goal each milestone), and art must be scoped hard (a tight trick-animation set, minimal environments, placeholder-free but small) or the team should add an artist within D+A ≤ 3.</w:t>
       </w:r>
       <w:r>
         <w:t xml:space="preserve"> </w:t>
@@ -2509,6 +2551,18 @@
     <w:p>
       <w:pPr>
         <w:numPr>
+          <w:ilvl w:val="1"/>
+          <w:numId w:val="1018"/>
+        </w:numPr>
+        <w:pStyle w:val="Compact"/>
+      </w:pPr>
+      <w:r>
+        <w:t xml:space="preserve">M1D11 Art Proof of Concept (conditional — 0-artist team, Design-owned): the visual direction — rider + jet-ski, trick animations, water/spray/splash/spark VFX, escalating environments, HUD and cosmetics; 2 mockup screens</w:t>
+      </w:r>
+    </w:p>
+    <w:p>
+      <w:pPr>
+        <w:numPr>
           <w:ilvl w:val="0"/>
           <w:numId w:val="1017"/>
         </w:numPr>
@@ -2530,7 +2584,22 @@
         <w:pStyle w:val="Compact"/>
       </w:pPr>
       <w:r>
-        <w:t xml:space="preserve">M2D1 ⭐ Features Design Iteration &amp; Showcase Readiness</w:t>
+        <w:t xml:space="preserve">M2D1 ⭐ Features Design Iteration &amp; Showcase Readiness —</w:t>
+      </w:r>
+      <w:r>
+        <w:t xml:space="preserve"> </w:t>
+      </w:r>
+      <w:r>
+        <w:rPr>
+          <w:b/>
+        </w:rPr>
+        <w:t xml:space="preserve">also folds in the required clean-monetization rework of the gacha</w:t>
+      </w:r>
+      <w:r>
+        <w:t xml:space="preserve"> </w:t>
+      </w:r>
+      <w:r>
+        <w:t xml:space="preserve">(cosmetic-only, transparent odds, no pay-to-win, no manipulative loops) + a scope-integrity statement (previously D8, absorbed here since the solo designer also carries D11)</w:t>
       </w:r>
     </w:p>
     <w:p>
@@ -2542,7 +2611,7 @@
         <w:pStyle w:val="Compact"/>
       </w:pPr>
       <w:r>
-        <w:t xml:space="preserve">M2D8 Monetization &amp; Scope Integrity Design (the **gacha reworked to the module's clean-monetization rule** — cosmetic-only, transparent odds, no pay-to-win — plus a scope-integrity statement)</w:t>
+        <w:t xml:space="preserve">M2D11 Art Implementation Quality (conditional — 0-artist team, Design-owned): all in-game art implemented in-engine, no placeholders — rider + jet-ski, trick animations, water/spray/splash/spark VFX, escalating environments, HUD and cosmetics</w:t>
       </w:r>
     </w:p>
     <w:p>
@@ -2629,85 +2698,67 @@
         <w:rPr>
           <w:b/>
         </w:rPr>
-        <w:t xml:space="preserve">Art M1:</w:t>
-      </w:r>
-      <w:r>
-        <w:t xml:space="preserve"> </w:t>
-      </w:r>
-      <w:r>
-        <w:t xml:space="preserve">2 artists justified (trick-animation-heavy + water/particle VFX)</w:t>
-      </w:r>
-    </w:p>
-    <w:p>
-      <w:pPr>
-        <w:numPr>
-          <w:ilvl w:val="1"/>
-          <w:numId w:val="1022"/>
-        </w:numPr>
-        <w:pStyle w:val="Compact"/>
-      </w:pPr>
-      <w:r>
-        <w:t xml:space="preserve">M1A1 ⭐ Art Bible / Proof of Concept (the arcade-sports visual direction — palette, water look, readability at speed)</w:t>
-      </w:r>
-    </w:p>
-    <w:p>
-      <w:pPr>
-        <w:numPr>
-          <w:ilvl w:val="1"/>
-          <w:numId w:val="1022"/>
-        </w:numPr>
-        <w:pStyle w:val="Compact"/>
-      </w:pPr>
-      <w:r>
-        <w:t xml:space="preserve">M1A2 Character Concepts &amp; Model Sheets (the rider + the jet-ski, with cosmetic-variant sheets)</w:t>
-      </w:r>
-    </w:p>
-    <w:p>
-      <w:pPr>
-        <w:numPr>
-          <w:ilvl w:val="1"/>
-          <w:numId w:val="1022"/>
-        </w:numPr>
-        <w:pStyle w:val="Compact"/>
-      </w:pPr>
-      <w:r>
-        <w:t xml:space="preserve">M1A3 Environment, Props &amp; VFX Concepts (the water, obstacles, trick terrain and the escalating biomes + splash/spark effect concepts)</w:t>
-      </w:r>
-    </w:p>
-    <w:p>
-      <w:pPr>
-        <w:numPr>
-          <w:ilvl w:val="1"/>
-          <w:numId w:val="1022"/>
-        </w:numPr>
-        <w:pStyle w:val="Compact"/>
-      </w:pPr>
-      <w:r>
-        <w:t xml:space="preserve">M1A4 UI Art Concepts &amp; Typography (timer/combo/score HUD, gacha screens)</w:t>
-      </w:r>
-    </w:p>
-    <w:p>
-      <w:pPr>
-        <w:numPr>
-          <w:ilvl w:val="1"/>
-          <w:numId w:val="1022"/>
-        </w:numPr>
-        <w:pStyle w:val="Compact"/>
-      </w:pPr>
-      <w:r>
-        <w:t xml:space="preserve">M1A5 Animation Foundations (the trick animations — the core art payload — plus ride/land/wipeout)</w:t>
-      </w:r>
-    </w:p>
-    <w:p>
-      <w:pPr>
-        <w:numPr>
-          <w:ilvl w:val="1"/>
-          <w:numId w:val="1022"/>
-        </w:numPr>
-        <w:pStyle w:val="Compact"/>
-      </w:pPr>
-      <w:r>
-        <w:t xml:space="preserve">M1A6 Early Asset Production — Prototype Support</w:t>
+        <w:t xml:space="preserve">Art:</w:t>
+      </w:r>
+      <w:r>
+        <w:t xml:space="preserve"> </w:t>
+      </w:r>
+      <w:r>
+        <w:rPr>
+          <w:i/>
+        </w:rPr>
+        <w:t xml:space="preserve">no artist on this team (0 Art).</w:t>
+      </w:r>
+      <w:r>
+        <w:t xml:space="preserve"> </w:t>
+      </w:r>
+      <w:r>
+        <w:t xml:space="preserve">The trick-animation + water/particle-VFX surface (rider + jet-ski, trick animations, water/spray/splash/spark effects, escalating environments, HUD and gacha cosmetics) is owned by the designer through the</w:t>
+      </w:r>
+      <w:r>
+        <w:t xml:space="preserve"> </w:t>
+      </w:r>
+      <w:r>
+        <w:rPr>
+          <w:b/>
+        </w:rPr>
+        <w:t xml:space="preserve">D11 conditional</w:t>
+      </w:r>
+      <w:r>
+        <w:t xml:space="preserve"> </w:t>
+      </w:r>
+      <w:r>
+        <w:t xml:space="preserve">—</w:t>
+      </w:r>
+      <w:r>
+        <w:t xml:space="preserve"> </w:t>
+      </w:r>
+      <w:r>
+        <w:rPr>
+          <w:b/>
+        </w:rPr>
+        <w:t xml:space="preserve">M1D11 Art Proof of Concept</w:t>
+      </w:r>
+      <w:r>
+        <w:t xml:space="preserve"> </w:t>
+      </w:r>
+      <w:r>
+        <w:t xml:space="preserve">(visual direction + 2 mockups) and</w:t>
+      </w:r>
+      <w:r>
+        <w:t xml:space="preserve"> </w:t>
+      </w:r>
+      <w:r>
+        <w:rPr>
+          <w:b/>
+        </w:rPr>
+        <w:t xml:space="preserve">M2D11 Art Implementation Quality</w:t>
+      </w:r>
+      <w:r>
+        <w:t xml:space="preserve"> </w:t>
+      </w:r>
+      <w:r>
+        <w:t xml:space="preserve">(all art in-engine, no placeholders), shown above as the last Design goal each milestone. Scope art hard, or add an artist within D+A ≤ 3.</w:t>
       </w:r>
     </w:p>
     <w:p>
@@ -2722,79 +2773,31 @@
         <w:rPr>
           <w:b/>
         </w:rPr>
-        <w:t xml:space="preserve">Art M2:</w:t>
-      </w:r>
-    </w:p>
-    <w:p>
-      <w:pPr>
-        <w:numPr>
-          <w:ilvl w:val="1"/>
-          <w:numId w:val="1023"/>
-        </w:numPr>
-        <w:pStyle w:val="Compact"/>
-      </w:pPr>
-      <w:r>
-        <w:t xml:space="preserve">M2A1 ⭐ Critical Asset Production &amp; In-Engine Visual Quality</w:t>
-      </w:r>
-    </w:p>
-    <w:p>
-      <w:pPr>
-        <w:numPr>
-          <w:ilvl w:val="1"/>
-          <w:numId w:val="1023"/>
-        </w:numPr>
-        <w:pStyle w:val="Compact"/>
-      </w:pPr>
-      <w:r>
-        <w:t xml:space="preserve">M2A2 Character Animation — Extensive (the full trick set + combo/land/wipeout reactions)</w:t>
-      </w:r>
-    </w:p>
-    <w:p>
-      <w:pPr>
-        <w:numPr>
-          <w:ilvl w:val="1"/>
-          <w:numId w:val="1023"/>
-        </w:numPr>
-        <w:pStyle w:val="Compact"/>
-      </w:pPr>
-      <w:r>
-        <w:t xml:space="preserve">M2A3 Environment Alive — Ambient Animation &amp; Layering (living water + escalating background)</w:t>
-      </w:r>
-    </w:p>
-    <w:p>
-      <w:pPr>
-        <w:numPr>
-          <w:ilvl w:val="1"/>
-          <w:numId w:val="1023"/>
-        </w:numPr>
-        <w:pStyle w:val="Compact"/>
-      </w:pPr>
-      <w:r>
-        <w:t xml:space="preserve">M2A4 UI Art — States &amp; Feedback (trick-landed / failed / combo-multiplier states)</w:t>
-      </w:r>
-    </w:p>
-    <w:p>
-      <w:pPr>
-        <w:numPr>
-          <w:ilvl w:val="1"/>
-          <w:numId w:val="1023"/>
-        </w:numPr>
-        <w:pStyle w:val="Compact"/>
-      </w:pPr>
-      <w:r>
-        <w:t xml:space="preserve">M2A5 VFX — Critical Effects &amp; Transitions (splashes, spray, sparks, combo bursts — the game's core read)</w:t>
-      </w:r>
-    </w:p>
-    <w:p>
-      <w:pPr>
-        <w:numPr>
-          <w:ilvl w:val="1"/>
-          <w:numId w:val="1023"/>
-        </w:numPr>
-        <w:pStyle w:val="Compact"/>
-      </w:pPr>
-      <w:r>
-        <w:t xml:space="preserve">M2A6 Cutscenes &amp; Storyboards (the BlueBull competition intro / victory beats)</w:t>
+        <w:t xml:space="preserve">TEAM M1:</w:t>
+      </w:r>
+    </w:p>
+    <w:p>
+      <w:pPr>
+        <w:numPr>
+          <w:ilvl w:val="1"/>
+          <w:numId w:val="1022"/>
+        </w:numPr>
+        <w:pStyle w:val="Compact"/>
+      </w:pPr>
+      <w:r>
+        <w:t xml:space="preserve">M1TA1 ⭐ Overall Audio Experience — initial BGM/SFX from the week-5 needs list present &amp; working in the prototype (upbeat arcade BGM, engine/splash, trick-success/fail, combo and wipeout cues), suitable and correctly triggered.</w:t>
+      </w:r>
+    </w:p>
+    <w:p>
+      <w:pPr>
+        <w:numPr>
+          <w:ilvl w:val="1"/>
+          <w:numId w:val="1022"/>
+        </w:numPr>
+        <w:pStyle w:val="Compact"/>
+      </w:pPr>
+      <w:r>
+        <w:t xml:space="preserve">M1TA2 ⭐ Audio Engine Functionality — data-driven audio pipeline (add/replace files without recompiling) + reliable multi-channel playback for overlapping trick/splash SFX.</w:t>
       </w:r>
     </w:p>
     <w:p>
@@ -2809,45 +2812,6 @@
         <w:rPr>
           <w:b/>
         </w:rPr>
-        <w:t xml:space="preserve">TEAM M1:</w:t>
-      </w:r>
-    </w:p>
-    <w:p>
-      <w:pPr>
-        <w:numPr>
-          <w:ilvl w:val="1"/>
-          <w:numId w:val="1024"/>
-        </w:numPr>
-        <w:pStyle w:val="Compact"/>
-      </w:pPr>
-      <w:r>
-        <w:t xml:space="preserve">M1TA1 ⭐ Overall Audio Experience — initial BGM/SFX from the week-5 needs list present &amp; working in the prototype (upbeat arcade BGM, engine/splash, trick-success/fail, combo and wipeout cues), suitable and correctly triggered.</w:t>
-      </w:r>
-    </w:p>
-    <w:p>
-      <w:pPr>
-        <w:numPr>
-          <w:ilvl w:val="1"/>
-          <w:numId w:val="1024"/>
-        </w:numPr>
-        <w:pStyle w:val="Compact"/>
-      </w:pPr>
-      <w:r>
-        <w:t xml:space="preserve">M1TA2 ⭐ Audio Engine Functionality — data-driven audio pipeline (add/replace files without recompiling) + reliable multi-channel playback for overlapping trick/splash SFX.</w:t>
-      </w:r>
-    </w:p>
-    <w:p>
-      <w:pPr>
-        <w:numPr>
-          <w:ilvl w:val="0"/>
-          <w:numId w:val="1017"/>
-        </w:numPr>
-        <w:pStyle w:val="Compact"/>
-      </w:pPr>
-      <w:r>
-        <w:rPr>
-          <w:b/>
-        </w:rPr>
         <w:t xml:space="preserve">TEAM M2:</w:t>
       </w:r>
     </w:p>
@@ -2855,7 +2819,7 @@
       <w:pPr>
         <w:numPr>
           <w:ilvl w:val="1"/>
-          <w:numId w:val="1025"/>
+          <w:numId w:val="1023"/>
         </w:numPr>
         <w:pStyle w:val="Compact"/>
       </w:pPr>
@@ -2867,7 +2831,7 @@
       <w:pPr>
         <w:numPr>
           <w:ilvl w:val="1"/>
-          <w:numId w:val="1025"/>
+          <w:numId w:val="1023"/>
         </w:numPr>
         <w:pStyle w:val="Compact"/>
       </w:pPr>
@@ -2879,7 +2843,7 @@
       <w:pPr>
         <w:numPr>
           <w:ilvl w:val="1"/>
-          <w:numId w:val="1025"/>
+          <w:numId w:val="1023"/>
         </w:numPr>
         <w:pStyle w:val="Compact"/>
       </w:pPr>
@@ -3224,12 +3188,6 @@
     <w:abstractNumId w:val="991"/>
   </w:num>
   <w:num w:numId="1023">
-    <w:abstractNumId w:val="991"/>
-  </w:num>
-  <w:num w:numId="1024">
-    <w:abstractNumId w:val="991"/>
-  </w:num>
-  <w:num w:numId="1025">
     <w:abstractNumId w:val="991"/>
   </w:num>
 </w:numbering>

</xml_diff>